<commit_message>
add base backend V1
add base backend V1
</commit_message>
<xml_diff>
--- a/Báo cáo/Báo cáo đồ án tốt nghiệp nhóm 2 - tuần 1.docx
+++ b/Báo cáo/Báo cáo đồ án tốt nghiệp nhóm 2 - tuần 1.docx
@@ -6850,8 +6850,21 @@
         <w:pStyle w:val="Doan"/>
       </w:pPr>
       <w:r>
-        <w:t>Hệ thống đề xuất không chạy đua về tính năng kế toán với đối thủ, mà đánh vào "tử huyệt" về công nghệ và trải nghiệm người dùng thông qua 3 mũi nhọn:</w:t>
+        <w:t xml:space="preserve">Hệ thống đề xuất không chạy đua về độ sâu nghiệp vụ tài chính với các đối thủ (CyHome, PiHome), mà tập trung vào mô hình All-in-One thực sự dành cho khu </w:t>
       </w:r>
+      <w:r>
+        <w:lastRenderedPageBreak/>
+        <w:t>chung cư vừa và nhỏ. Với kiến trúc 1 module Base + 3 module nhỏ (Quản lý tài sản – Quản lý dân cư – Quản lý dịch vụ), hệ thống mang lại 3 điểm mạnh đột phá sau:</w:t>
+      </w:r>
+      <w:r>
+        <w:t>:</w:t>
+      </w:r>
+    </w:p>
+    <w:p>
+      <w:pPr>
+        <w:pStyle w:val="Doan"/>
+        <w:ind w:left="1080" w:firstLine="0"/>
+      </w:pPr>
     </w:p>
     <w:p>
       <w:pPr>
@@ -6860,66 +6873,37 @@
           <w:ilvl w:val="1"/>
           <w:numId w:val="14"/>
         </w:numPr>
-      </w:pPr>
-      <w:bookmarkStart w:id="14" w:name="_Toc220359304"/>
+        <w:rPr>
+          <w:rFonts w:eastAsiaTheme="minorEastAsia"/>
+        </w:rPr>
+      </w:pPr>
       <w:r>
-        <w:t>Module Dịch vụ &amp; Bản đồ (The "Digital Twin" Approach)</w:t>
+        <w:t>Module Base (Core System) – Nền tảng thống nhất dữ liệu</w:t>
       </w:r>
-      <w:bookmarkEnd w:id="14"/>
     </w:p>
     <w:p>
       <w:pPr>
         <w:pStyle w:val="Doan"/>
-        <w:numPr>
-          <w:ilvl w:val="0"/>
-          <w:numId w:val="17"/>
-        </w:numPr>
-      </w:pPr>
+      </w:pPr>
+      <w:bookmarkStart w:id="14" w:name="_Toc220359305"/>
       <w:r>
-        <w:lastRenderedPageBreak/>
-        <w:t xml:space="preserve">Đây là tính năng </w:t>
+        <w:t>Đây là “trái tim” của toàn bộ hệ thống, đảm bảo tất cả dữ liệu được chia sẻ thời gian thực giữa 3 module con (không cần nhập lại nhiều lần).</w:t>
       </w:r>
+    </w:p>
+    <w:p>
+      <w:pPr>
+        <w:pStyle w:val="Doan"/>
+      </w:pPr>
       <w:r>
-        <w:t>hay nhất</w:t>
+        <w:t xml:space="preserve"> Giao diện quản trị web đơn giản, dễ sử dụng ngay cả với nhân viên BQL lớn tuổi.</w:t>
       </w:r>
+    </w:p>
+    <w:p>
+      <w:pPr>
+        <w:pStyle w:val="Doan"/>
+      </w:pPr>
       <w:r>
-        <w:t xml:space="preserve"> của đồ án. Hệ thống tạo ra một Bản sao số (Digital Twin) của khu đô thị trên nền tảng Web/App.</w:t>
-      </w:r>
-    </w:p>
-    <w:p>
-      <w:pPr>
-        <w:pStyle w:val="Doan"/>
-        <w:numPr>
-          <w:ilvl w:val="0"/>
-          <w:numId w:val="17"/>
-        </w:numPr>
-      </w:pPr>
-      <w:r>
-        <w:t>Trực quan hóa sự cố thời gian thực: Thay vì đọc dòng chữ "Hỏng đèn đường số 5", nhân viên kỹ thuật nhìn thấy một điểm đỏ nhấp nháy tại tọa độ (X, Y) trên bản đồ. Click vào điểm đó sẽ thấy ảnh chụp hiện trường và lịch sử sửa chữa.</w:t>
-      </w:r>
-    </w:p>
-    <w:p>
-      <w:pPr>
-        <w:pStyle w:val="Doan"/>
-        <w:numPr>
-          <w:ilvl w:val="0"/>
-          <w:numId w:val="17"/>
-        </w:numPr>
-      </w:pPr>
-      <w:r>
-        <w:t>Quản lý tài sản ngoại vi: Đối với các khu đô thị lớn, việc tìm kiếm một hố ga bị mất nắp hay một cây xanh bị nghiêng là cực khó nếu không có bản đồ định vị. Module này giải quyết triệt để bài toán điều phối nhân sự ngoài trời.</w:t>
-      </w:r>
-    </w:p>
-    <w:p>
-      <w:pPr>
-        <w:pStyle w:val="Doan"/>
-        <w:numPr>
-          <w:ilvl w:val="0"/>
-          <w:numId w:val="17"/>
-        </w:numPr>
-      </w:pPr>
-      <w:r>
-        <w:t>Tích hợp LBS (Location Based Services): Cư dân có thể tìm thấy tiệm thuốc, siêu thị, phòng Gym gần nhất ngay trên App và xem đánh giá từ hàng xóm.</w:t>
+        <w:t>Hỗ trợ phân quyền rõ ràng (BQL – Nhân viên kỹ thuật – Cư dân) và log hoạt động đầy đủ.</w:t>
       </w:r>
     </w:p>
     <w:p>
@@ -6930,46 +6914,34 @@
           <w:numId w:val="14"/>
         </w:numPr>
       </w:pPr>
-      <w:bookmarkStart w:id="15" w:name="_Toc220359305"/>
+      <w:bookmarkStart w:id="15" w:name="_Toc220359307"/>
+      <w:bookmarkEnd w:id="14"/>
       <w:r>
-        <w:t>Sức mạnh của Trí tuệ nhân tạo (AI-Driven Operations)</w:t>
+        <w:t>Module Quản lý Tài sản – Quản lý tài sản chung cư chuyên sâu và dễ tra cứu</w:t>
       </w:r>
-      <w:bookmarkEnd w:id="15"/>
     </w:p>
     <w:p>
       <w:pPr>
         <w:pStyle w:val="Doan"/>
-        <w:numPr>
-          <w:ilvl w:val="0"/>
-          <w:numId w:val="17"/>
-        </w:numPr>
       </w:pPr>
       <w:r>
-        <w:t>Đồ án tích hợp các thuật toán AI/Machine Learning để biến dữ liệu chết thành dữ liệu sống:</w:t>
+        <w:t xml:space="preserve">Quản lý toàn bộ tài sản cố định và tài sản ngắn hạn (thang máy, máy bơm, hệ thống điện nước, camera, ghế đá, cây xanh, hố ga…). </w:t>
       </w:r>
     </w:p>
     <w:p>
       <w:pPr>
         <w:pStyle w:val="Doan"/>
-        <w:numPr>
-          <w:ilvl w:val="0"/>
-          <w:numId w:val="17"/>
-        </w:numPr>
       </w:pPr>
       <w:r>
-        <w:t>Phân loại sự cố tự động (Image Classification):</w:t>
+        <w:t xml:space="preserve">Theo dõi tình trạng tài sản theo vòng đời (mua sắm – bảo trì – khấu hao – thanh lý). </w:t>
       </w:r>
     </w:p>
     <w:p>
       <w:pPr>
         <w:pStyle w:val="Doan"/>
-        <w:numPr>
-          <w:ilvl w:val="0"/>
-          <w:numId w:val="17"/>
-        </w:numPr>
       </w:pPr>
       <w:r>
-        <w:t>Nguyên lý: Người dân chụp ảnh đống rác. AI (Computer Vision) tự nhận diện đây là "Vấn đề vệ sinh" và tự động chuyển phiếu yêu cầu (Ticket) cho Đội vệ sinh, bỏ qua bước điều phối thủ công của lễ tân.</w:t>
+        <w:t>Lập lịch bảo trì định kỳ tự động và nhắc nhở qua App. Đột phá: Sử dụng giao diện dạng danh sách + thẻ (card view) kết hợp tìm kiếm nhanh theo vị trí tầng/block, giúp nhân viên kỹ thuật tìm đúng thiết bị chỉ trong 10 giây thay vì phải lục sổ sách hoặc đi hỏi lung tung.</w:t>
       </w:r>
     </w:p>
     <w:p>
@@ -6979,43 +6951,109 @@
           <w:ilvl w:val="1"/>
           <w:numId w:val="14"/>
         </w:numPr>
+        <w:rPr>
+          <w:sz w:val="24"/>
+          <w:szCs w:val="24"/>
+        </w:rPr>
       </w:pPr>
       <w:r>
-        <w:t xml:space="preserve"> </w:t>
+        <w:t>Module Quản lý Dân cư – Hồ sơ cư dân chính xác và thu phí minh bạch</w:t>
       </w:r>
-      <w:bookmarkStart w:id="16" w:name="_Toc220359306"/>
+    </w:p>
+    <w:p>
+      <w:pPr>
+        <w:pStyle w:val="Doan"/>
+      </w:pPr>
       <w:r>
-        <w:t>Mạng xã hội chuyên biệt "Sạch" và "Tin cậy"</w:t>
+        <w:t xml:space="preserve">Quản lý đầy đủ thông tin nhân khẩu (căn hộ, chủ hộ, thành viên, phương tiện, thẻ cư dân). </w:t>
       </w:r>
-      <w:bookmarkEnd w:id="16"/>
     </w:p>
     <w:p>
       <w:pPr>
         <w:pStyle w:val="Doan"/>
+      </w:pPr>
+      <w:r>
+        <w:t xml:space="preserve">Tự động tính và nhắc nợ phí quản lý, phí dịch vụ, phí gửi xe theo từng hộ. </w:t>
+      </w:r>
+    </w:p>
+    <w:p>
+      <w:pPr>
+        <w:pStyle w:val="Doan"/>
+      </w:pPr>
+      <w:r>
+        <w:t>Cư dân có thể xem hóa đơn, lịch sử thanh toán và nộp phí trực tiếp qua App (tích hợp VNPay/MoMo cơ bản). Đột phá: Tự động phát hiện trùng lặp hồ sơ (tên giống, số điện thoại giống, căn hộ giống) và cảnh báo ngay khi nhập liệu, tránh sai sót thu phí sai chủ hộ – vấn đề rất phổ biến ở các chung cư cũ.</w:t>
+      </w:r>
+    </w:p>
+    <w:p>
+      <w:pPr>
+        <w:pStyle w:val="Cap2"/>
         <w:numPr>
-          <w:ilvl w:val="0"/>
-          <w:numId w:val="17"/>
+          <w:ilvl w:val="1"/>
+          <w:numId w:val="14"/>
         </w:numPr>
+        <w:rPr>
+          <w:sz w:val="24"/>
+          <w:szCs w:val="24"/>
+        </w:rPr>
       </w:pPr>
       <w:r>
-        <w:t>Định danh cư dân (Verified Residents): Khác với Facebook nơi ai cũng có thể comment, mạng xã hội này yêu cầu xác thực là cư dân đang sinh sống. Điều này loại bỏ tin rác, lừa đảo, quảng cáo bẩn.</w:t>
+        <w:t>Module Quản lý Dịch vụ – Xử lý sự cố nhanh và dịch vụ tiện ích</w:t>
       </w:r>
     </w:p>
     <w:p>
       <w:pPr>
         <w:pStyle w:val="Doan"/>
-        <w:numPr>
-          <w:ilvl w:val="0"/>
-          <w:numId w:val="17"/>
-        </w:numPr>
       </w:pPr>
       <w:r>
-        <w:t>AI giám sát cảm xúc (Sentiment Analysis): Ban quản lý có một Dashboard theo dõi "Chỉ số hạnh phúc" của khu dân cư theo thời gian thực. Nếu biểu đồ cảm xúc đi xuống (nhiều từ khóa tiêu cực như "bẩn", "ồn", "trộm"), hệ thống sẽ báo động đỏ để BQL can thiệp kịp thời.</w:t>
+        <w:t xml:space="preserve">Quản lý toàn bộ ticket/phàn nàn của cư dân (hỏng thang máy, nước yếu, vệ sinh, an ninh…). </w:t>
       </w:r>
     </w:p>
     <w:p>
       <w:pPr>
         <w:pStyle w:val="Doan"/>
+      </w:pPr>
+      <w:r>
+        <w:t xml:space="preserve">Phân công tự động cho nhân viên kỹ thuật/bảo vệ theo block/tầng. • Theo dõi tiến độ xử lý ticket theo thời gian thực (trạng thái: Mới – Đang xử lý – Hoàn thành). </w:t>
+      </w:r>
+    </w:p>
+    <w:p>
+      <w:pPr>
+        <w:pStyle w:val="Doan"/>
+      </w:pPr>
+      <w:r>
+        <w:lastRenderedPageBreak/>
+        <w:t>Quản lý các dịch vụ bổ sung (gửi xe, giữ trẻ, giặt ủi, internet…). Đột phá: Cư dân chỉ cần chụp ảnh + mô tả ngắn → hệ thống tự động gán ticket cho đội ngũ phù hợp và gửi thông báo tiến độ, giúp thời gian xử lý trung bình giảm từ 2-3 ngày xuống còn 4-6 giờ.</w:t>
+      </w:r>
+    </w:p>
+    <w:p>
+      <w:pPr>
+        <w:pStyle w:val="Doan"/>
+      </w:pPr>
+    </w:p>
+    <w:p>
+      <w:pPr>
+        <w:pStyle w:val="Doan"/>
+      </w:pPr>
+    </w:p>
+    <w:p>
+      <w:pPr>
+        <w:pStyle w:val="Doan"/>
+      </w:pPr>
+    </w:p>
+    <w:p>
+      <w:pPr>
+        <w:pStyle w:val="Doan"/>
+      </w:pPr>
+    </w:p>
+    <w:p>
+      <w:pPr>
+        <w:pStyle w:val="Doan"/>
+      </w:pPr>
+    </w:p>
+    <w:p>
+      <w:pPr>
+        <w:pStyle w:val="Doan"/>
+        <w:ind w:firstLine="0"/>
       </w:pPr>
     </w:p>
     <w:p>
@@ -7026,11 +7064,10 @@
           <w:numId w:val="14"/>
         </w:numPr>
       </w:pPr>
-      <w:bookmarkStart w:id="17" w:name="_Toc220359307"/>
       <w:r>
         <w:t>Điểm yếu và các rào cản thực tế</w:t>
       </w:r>
-      <w:bookmarkEnd w:id="17"/>
+      <w:bookmarkEnd w:id="15"/>
     </w:p>
     <w:p>
       <w:pPr>
@@ -7055,18 +7092,17 @@
       <w:r>
         <w:t xml:space="preserve"> </w:t>
       </w:r>
-      <w:bookmarkStart w:id="18" w:name="_Toc220359308"/>
+      <w:bookmarkStart w:id="16" w:name="_Toc220359308"/>
       <w:r>
         <w:t>Độ sâu về Nghiệp vụ Tài chính - Kế toán (Financial Depth)</w:t>
       </w:r>
-      <w:bookmarkEnd w:id="18"/>
+      <w:bookmarkEnd w:id="16"/>
     </w:p>
     <w:p>
       <w:pPr>
         <w:pStyle w:val="Doan"/>
       </w:pPr>
       <w:r>
-        <w:lastRenderedPageBreak/>
         <w:t>Thực tế đối thủ: CyHome có thể xử lý các nghiệp vụ kế toán phức tạp: khấu trừ thuế, phân bổ chi phí, quản lý dòng tiền, tích hợp trực tiếp với SAP/Oracle hoặc Core Banking của ngân hàng.</w:t>
       </w:r>
     </w:p>
@@ -7086,11 +7122,11 @@
           <w:numId w:val="14"/>
         </w:numPr>
       </w:pPr>
-      <w:bookmarkStart w:id="19" w:name="_Toc220359309"/>
+      <w:bookmarkStart w:id="17" w:name="_Toc220359309"/>
       <w:r>
         <w:t>Khả năng tích hợp Phần cứng IoT (Hardware Integration)</w:t>
       </w:r>
-      <w:bookmarkEnd w:id="19"/>
+      <w:bookmarkEnd w:id="17"/>
     </w:p>
     <w:p>
       <w:pPr>
@@ -7122,11 +7158,11 @@
       <w:r>
         <w:t xml:space="preserve"> </w:t>
       </w:r>
-      <w:bookmarkStart w:id="20" w:name="_Toc220359310"/>
+      <w:bookmarkStart w:id="18" w:name="_Toc220359310"/>
       <w:r>
         <w:t>Vấn đề về Dữ liệu cũ và Thói quen người dùng (Legacy &amp; Adoption)</w:t>
       </w:r>
-      <w:bookmarkEnd w:id="20"/>
+      <w:bookmarkEnd w:id="18"/>
     </w:p>
     <w:p>
       <w:pPr>
@@ -7157,11 +7193,12 @@
           <w:numId w:val="14"/>
         </w:numPr>
       </w:pPr>
-      <w:bookmarkStart w:id="21" w:name="_Toc220359311"/>
+      <w:bookmarkStart w:id="19" w:name="_Toc220359311"/>
       <w:r>
+        <w:lastRenderedPageBreak/>
         <w:t>Đề xuất giải pháp và công nghệ</w:t>
       </w:r>
-      <w:bookmarkEnd w:id="21"/>
+      <w:bookmarkEnd w:id="19"/>
     </w:p>
     <w:p>
       <w:pPr>
@@ -7178,11 +7215,11 @@
       <w:r>
         <w:t xml:space="preserve"> </w:t>
       </w:r>
-      <w:bookmarkStart w:id="22" w:name="_Toc220359312"/>
+      <w:bookmarkStart w:id="20" w:name="_Toc220359312"/>
       <w:r>
         <w:t>Kiến trúc hệ thống</w:t>
       </w:r>
-      <w:bookmarkEnd w:id="22"/>
+      <w:bookmarkEnd w:id="20"/>
     </w:p>
     <w:p>
       <w:pPr>
@@ -7239,11 +7276,11 @@
       <w:r>
         <w:t xml:space="preserve"> </w:t>
       </w:r>
-      <w:bookmarkStart w:id="23" w:name="_Toc220359313"/>
+      <w:bookmarkStart w:id="21" w:name="_Toc220359313"/>
       <w:r>
         <w:t>Chi tiết các Phân hệ và Tích hợp AI</w:t>
       </w:r>
-      <w:bookmarkEnd w:id="23"/>
+      <w:bookmarkEnd w:id="21"/>
     </w:p>
     <w:p>
       <w:pPr>
@@ -7253,11 +7290,11 @@
           <w:numId w:val="14"/>
         </w:numPr>
       </w:pPr>
-      <w:bookmarkStart w:id="24" w:name="_Toc220359314"/>
+      <w:bookmarkStart w:id="22" w:name="_Toc220359314"/>
       <w:r>
         <w:t>Module 1: Dịch vụ &amp; Bản đồ (Map-centric Services)</w:t>
       </w:r>
-      <w:bookmarkEnd w:id="24"/>
+      <w:bookmarkEnd w:id="22"/>
     </w:p>
     <w:p>
       <w:pPr>
@@ -7303,7 +7340,6 @@
         </w:numPr>
       </w:pPr>
       <w:r>
-        <w:lastRenderedPageBreak/>
         <w:t>Định vị vị trí sự cố, tài sản công cộng (ghế đá, cột đèn), và vị trí nhân viên bảo vệ.</w:t>
       </w:r>
     </w:p>
@@ -7385,11 +7421,11 @@
           <w:numId w:val="14"/>
         </w:numPr>
       </w:pPr>
-      <w:bookmarkStart w:id="25" w:name="_Toc220359315"/>
+      <w:bookmarkStart w:id="23" w:name="_Toc220359315"/>
       <w:r>
         <w:t>Module 2: Quản lý Khu (Resource Management)</w:t>
       </w:r>
-      <w:bookmarkEnd w:id="25"/>
+      <w:bookmarkEnd w:id="23"/>
     </w:p>
     <w:p>
       <w:pPr>
@@ -7491,6 +7527,7 @@
         </w:numPr>
       </w:pPr>
       <w:r>
+        <w:lastRenderedPageBreak/>
         <w:t>Giải pháp: Sử dụng Học máy (Machine Learning) với kỹ thuật Fuzzy Matching (Khớp mờ) và Levenshtein Distance.</w:t>
       </w:r>
     </w:p>
@@ -7514,11 +7551,11 @@
           <w:numId w:val="14"/>
         </w:numPr>
       </w:pPr>
-      <w:bookmarkStart w:id="26" w:name="_Toc220359316"/>
+      <w:bookmarkStart w:id="24" w:name="_Toc220359316"/>
       <w:r>
         <w:t>Module 3: Mạng xã hội Cư dân (Social Network)</w:t>
       </w:r>
-      <w:bookmarkEnd w:id="26"/>
+      <w:bookmarkEnd w:id="24"/>
     </w:p>
     <w:p>
       <w:pPr>
@@ -7585,7 +7622,6 @@
           <w:b/>
           <w:bCs/>
         </w:rPr>
-        <w:lastRenderedPageBreak/>
         <w:t>Tích hợp AI</w:t>
       </w:r>
       <w:r>
@@ -7765,7 +7801,6 @@
         <w:pStyle w:val="Doan"/>
       </w:pPr>
       <w:r>
-        <w:lastRenderedPageBreak/>
         <w:t xml:space="preserve">Luồng hoạt động </w:t>
       </w:r>
     </w:p>
@@ -7779,62 +7814,9 @@
         <w:pStyle w:val="Doan"/>
         <w:ind w:firstLine="0"/>
       </w:pPr>
-      <w:r>
-        <w:rPr>
-          <w:noProof/>
-        </w:rPr>
-        <w:drawing>
-          <wp:inline distT="0" distB="0" distL="0" distR="0" wp14:anchorId="3FF1F65B" wp14:editId="07BCD201">
-            <wp:extent cx="5567680" cy="8745855"/>
-            <wp:effectExtent l="0" t="0" r="0" b="0"/>
-            <wp:docPr id="4" name="Picture 4"/>
-            <wp:cNvGraphicFramePr>
-              <a:graphicFrameLocks xmlns:a="http://schemas.openxmlformats.org/drawingml/2006/main" noChangeAspect="1"/>
-            </wp:cNvGraphicFramePr>
-            <a:graphic xmlns:a="http://schemas.openxmlformats.org/drawingml/2006/main">
-              <a:graphicData uri="http://schemas.openxmlformats.org/drawingml/2006/picture">
-                <pic:pic xmlns:pic="http://schemas.openxmlformats.org/drawingml/2006/picture">
-                  <pic:nvPicPr>
-                    <pic:cNvPr id="0" name="Picture 1"/>
-                    <pic:cNvPicPr>
-                      <a:picLocks noChangeAspect="1" noChangeArrowheads="1"/>
-                    </pic:cNvPicPr>
-                  </pic:nvPicPr>
-                  <pic:blipFill>
-                    <a:blip r:embed="rId14" cstate="print">
-                      <a:extLst>
-                        <a:ext uri="{28A0092B-C50C-407E-A947-70E740481C1C}">
-                          <a14:useLocalDpi xmlns:a14="http://schemas.microsoft.com/office/drawing/2010/main" val="0"/>
-                        </a:ext>
-                      </a:extLst>
-                    </a:blip>
-                    <a:srcRect/>
-                    <a:stretch>
-                      <a:fillRect/>
-                    </a:stretch>
-                  </pic:blipFill>
-                  <pic:spPr bwMode="auto">
-                    <a:xfrm>
-                      <a:off x="0" y="0"/>
-                      <a:ext cx="5567680" cy="8745855"/>
-                    </a:xfrm>
-                    <a:prstGeom prst="rect">
-                      <a:avLst/>
-                    </a:prstGeom>
-                    <a:noFill/>
-                    <a:ln>
-                      <a:noFill/>
-                    </a:ln>
-                  </pic:spPr>
-                </pic:pic>
-              </a:graphicData>
-            </a:graphic>
-          </wp:inline>
-        </w:drawing>
-      </w:r>
     </w:p>
     <w:sectPr>
-      <w:footerReference w:type="default" r:id="rId15"/>
+      <w:footerReference w:type="default" r:id="rId14"/>
       <w:pgSz w:w="11907" w:h="18711" w:code="60"/>
       <w:pgMar w:top="1701" w:right="1134" w:bottom="1701" w:left="1985" w:header="720" w:footer="486" w:gutter="0"/>
       <w:pgNumType w:start="1"/>
@@ -8085,7 +8067,7 @@
             </wp:anchor>
           </w:drawing>
         </mc:Choice>
-        <mc:Fallback xmlns:w16sdtfl="http://schemas.microsoft.com/office/word/2024/wordml/sdtformatlock" xmlns:w16du="http://schemas.microsoft.com/office/word/2023/wordml/word16du" xmlns:oel="http://schemas.microsoft.com/office/2019/extlst">
+        <mc:Fallback xmlns:oel="http://schemas.microsoft.com/office/2019/extlst" xmlns:w16du="http://schemas.microsoft.com/office/word/2023/wordml/word16du" xmlns:w16sdtfl="http://schemas.microsoft.com/office/word/2024/wordml/sdtformatlock">
           <w:pict>
             <v:line w14:anchorId="613D34CE" id="Straight Connector 2" o:spid="_x0000_s1026" style="position:absolute;z-index:251659264;visibility:visible;mso-wrap-style:square;mso-width-percent:0;mso-height-percent:0;mso-wrap-distance-left:9pt;mso-wrap-distance-top:0;mso-wrap-distance-right:9pt;mso-wrap-distance-bottom:0;mso-position-horizontal:absolute;mso-position-horizontal-relative:text;mso-position-vertical:absolute;mso-position-vertical-relative:text;mso-width-percent:0;mso-height-percent:0;mso-width-relative:page;mso-height-relative:page" from="-27pt,22.05pt" to="459pt,22.05pt" o:gfxdata="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" strokeweight="6pt">
               <v:stroke linestyle="thickBetweenThin"/>
@@ -12396,7 +12378,6 @@
   <w:style w:type="character" w:default="1" w:styleId="DefaultParagraphFont">
     <w:name w:val="Default Paragraph Font"/>
     <w:uiPriority w:val="1"/>
-    <w:semiHidden/>
     <w:unhideWhenUsed/>
   </w:style>
   <w:style w:type="table" w:default="1" w:styleId="TableNormal">

</xml_diff>